<commit_message>
Point the Render guide at the main branch
Co-Authored-By: Claude Opus 5.5 <noreply@anthropic.com>
Claude-Session: https://claude.ai/code/session_01HHqRxpJCTrgDJCFSc4SatM
</commit_message>
<xml_diff>
--- a/tacsi/TACSI - putting it online (Render).docx
+++ b/tacsi/TACSI - putting it online (Render).docx
@@ -1136,7 +1136,7 @@
                 <w:rFonts w:ascii="Consolas" w:cs="Consolas" w:eastAsia="Consolas" w:hAnsi="Consolas"/>
                 <w:shd w:fill="EEEEEE" w:color="auto" w:val="clear"/>
               </w:rPr>
-              <w:t xml:space="preserve">claude/keen-mendel-w9hzf6</w:t>
+              <w:t xml:space="preserve">main</w:t>
             </w:r>
           </w:p>
         </w:tc>
@@ -2314,7 +2314,17 @@
         <w:t xml:space="preserve">Updates</w:t>
       </w:r>
       <w:r>
-        <w:t xml:space="preserve">: when TACSI's files change on GitHub, Render updates the website by itself within a few minutes.</w:t>
+        <w:t xml:space="preserve">: when changes to TACSI are merged into the </w:t>
+      </w:r>
+      <w:r>
+        <w:rPr>
+          <w:rFonts w:ascii="Consolas" w:cs="Consolas" w:eastAsia="Consolas" w:hAnsi="Consolas"/>
+          <w:shd w:fill="EEEEEE" w:color="auto" w:val="clear"/>
+        </w:rPr>
+        <w:t xml:space="preserve">main</w:t>
+      </w:r>
+      <w:r>
+        <w:t xml:space="preserve"> branch on GitHub, Render updates the website by itself within a few minutes. Each update restarts TACSI, so cases in the staff view are deleted. When you ask Claude Code for changes in a new session, say: "When you are done, merge the changes into main."</w:t>
       </w:r>
     </w:p>
     <w:p>
@@ -2653,7 +2663,7 @@
                 <w:rFonts w:ascii="Consolas" w:cs="Consolas" w:eastAsia="Consolas" w:hAnsi="Consolas"/>
                 <w:shd w:fill="EEEEEE" w:color="auto" w:val="clear"/>
               </w:rPr>
-              <w:t xml:space="preserve">claude/keen-mendel-w9hzf6</w:t>
+              <w:t xml:space="preserve">main</w:t>
             </w:r>
             <w:r>
               <w:t xml:space="preserve">. Then click </w:t>

</xml_diff>